<commit_message>
updated course 1 and 2 work products
</commit_message>
<xml_diff>
--- a/Course1 - Foundations of Data Science/Automatidata project proposal.docx
+++ b/Course1 - Foundations of Data Science/Automatidata project proposal.docx
@@ -327,7 +327,7 @@
             <w:sdt>
               <w:sdtPr>
                 <w:alias w:val="Milestone tasks"/>
-                <w:id w:val="-1237906245"/>
+                <w:id w:val="-1662175457"/>
                 <w:dropDownList w:lastValue="Establish structure for project workflow (PACE)">
                   <w:listItem w:displayText="Choose a task" w:value="Choose a task"/>
                   <w:listItem w:displayText="Compute descriptive statistics" w:value="Compute descriptive statistics"/>
@@ -378,7 +378,7 @@
             <w:sdt>
               <w:sdtPr>
                 <w:alias w:val="PACE dropdown selector"/>
-                <w:id w:val="1241465562"/>
+                <w:id w:val="817196350"/>
                 <w:dropDownList w:lastValue="Plan">
                   <w:listItem w:displayText="Select PACE stage" w:value="Select PACE stage"/>
                   <w:listItem w:displayText="Plan" w:value="Plan"/>
@@ -534,7 +534,7 @@
             <w:sdt>
               <w:sdtPr>
                 <w:alias w:val="Milestone tasks"/>
-                <w:id w:val="-2024974035"/>
+                <w:id w:val="1845724049"/>
                 <w:dropDownList w:lastValue="Write a project proposal">
                   <w:listItem w:displayText="Choose a task" w:value="Choose a task"/>
                   <w:listItem w:displayText="Compute descriptive statistics" w:value="Compute descriptive statistics"/>
@@ -586,7 +586,7 @@
             <w:sdt>
               <w:sdtPr>
                 <w:alias w:val="PACE dropdown selector"/>
-                <w:id w:val="1081218674"/>
+                <w:id w:val="656949462"/>
                 <w:dropDownList w:lastValue="Plan">
                   <w:listItem w:displayText="Select PACE stage" w:value="Select PACE stage"/>
                   <w:listItem w:displayText="Plan" w:value="Plan"/>
@@ -737,7 +737,7 @@
             <w:sdt>
               <w:sdtPr>
                 <w:alias w:val="Milestone tasks"/>
-                <w:id w:val="-2101755716"/>
+                <w:id w:val="1768942368"/>
                 <w:dropDownList w:lastValue="Inspect data files for missing data">
                   <w:listItem w:displayText="Choose a task" w:value="Choose a task"/>
                   <w:listItem w:displayText="Compute descriptive statistics" w:value="Compute descriptive statistics"/>
@@ -789,7 +789,7 @@
             <w:sdt>
               <w:sdtPr>
                 <w:alias w:val="PACE dropdown selector"/>
-                <w:id w:val="1602212677"/>
+                <w:id w:val="1177943465"/>
                 <w:dropDownList w:lastValue="Analyze">
                   <w:listItem w:displayText="Select PACE stage" w:value="Select PACE stage"/>
                   <w:listItem w:displayText="Plan" w:value="Plan"/>
@@ -869,7 +869,7 @@
             <w:pPr>
               <w:widowControl w:val="0"/>
               <w:spacing w:line="240" w:lineRule="auto"/>
-              <w:ind w:left="180" w:firstLine="0"/>
+              <w:ind w:left="0" w:firstLine="0"/>
               <w:rPr>
                 <w:sz w:val="20"/>
                 <w:szCs w:val="20"/>
@@ -885,40 +885,6 @@
               </w:rPr>
               <w:t xml:space="preserve">Senior Data Analyst</w:t>
             </w:r>
-            <w:r>
-              <w:rPr>
-                <w:rtl w:val="0"/>
-              </w:rPr>
-            </w:r>
-          </w:p>
-          <w:p>
-            <w:pPr>
-              <w:widowControl w:val="0"/>
-              <w:spacing w:line="240" w:lineRule="auto"/>
-              <w:ind w:left="180" w:firstLine="0"/>
-              <w:rPr>
-                <w:sz w:val="20"/>
-                <w:szCs w:val="20"/>
-                <w:highlight w:val="yellow"/>
-              </w:rPr>
-            </w:pPr>
-            <w:r>
-              <w:rPr>
-                <w:rtl w:val="0"/>
-              </w:rPr>
-            </w:r>
-          </w:p>
-          <w:p>
-            <w:pPr>
-              <w:widowControl w:val="0"/>
-              <w:spacing w:line="240" w:lineRule="auto"/>
-              <w:ind w:left="180" w:firstLine="0"/>
-              <w:rPr>
-                <w:sz w:val="20"/>
-                <w:szCs w:val="20"/>
-                <w:highlight w:val="yellow"/>
-              </w:rPr>
-            </w:pPr>
             <w:r>
               <w:rPr>
                 <w:rtl w:val="0"/>
@@ -1054,7 +1020,7 @@
             <w:sdt>
               <w:sdtPr>
                 <w:alias w:val="Milestone tasks"/>
-                <w:id w:val="-1848396059"/>
+                <w:id w:val="2022302025"/>
                 <w:dropDownList w:lastValue="Understand the data">
                   <w:listItem w:displayText="Choose a task" w:value="Choose a task"/>
                   <w:listItem w:displayText="Compute descriptive statistics" w:value="Compute descriptive statistics"/>
@@ -1107,7 +1073,7 @@
             <w:sdt>
               <w:sdtPr>
                 <w:alias w:val="PACE dropdown selector"/>
-                <w:id w:val="748979088"/>
+                <w:id w:val="324709876"/>
                 <w:dropDownList w:lastValue="Analyze">
                   <w:listItem w:displayText="Select PACE stage" w:value="Select PACE stage"/>
                   <w:listItem w:displayText="Plan" w:value="Plan"/>
@@ -1180,7 +1146,7 @@
             <w:pPr>
               <w:widowControl w:val="0"/>
               <w:spacing w:line="240" w:lineRule="auto"/>
-              <w:ind w:left="180" w:firstLine="0"/>
+              <w:ind w:left="0" w:firstLine="0"/>
               <w:rPr>
                 <w:sz w:val="20"/>
                 <w:szCs w:val="20"/>
@@ -1280,7 +1246,7 @@
             <w:sdt>
               <w:sdtPr>
                 <w:alias w:val="Milestone tasks"/>
-                <w:id w:val="-1360872678"/>
+                <w:id w:val="-1785141890"/>
                 <w:dropDownList w:lastValue="Data exploration and cleaning">
                   <w:listItem w:displayText="Choose a task" w:value="Choose a task"/>
                   <w:listItem w:displayText="Compute descriptive statistics" w:value="Compute descriptive statistics"/>
@@ -1333,7 +1299,7 @@
             <w:sdt>
               <w:sdtPr>
                 <w:alias w:val="PACE dropdown selector"/>
-                <w:id w:val="503630638"/>
+                <w:id w:val="79361426"/>
                 <w:dropDownList w:lastValue="Plan">
                   <w:listItem w:displayText="Select PACE stage" w:value="Select PACE stage"/>
                   <w:listItem w:displayText="Plan" w:value="Plan"/>
@@ -1369,7 +1335,7 @@
             <w:sdt>
               <w:sdtPr>
                 <w:alias w:val="PACE dropdown selector"/>
-                <w:id w:val="531336527"/>
+                <w:id w:val="107067315"/>
                 <w:dropDownList w:lastValue="Analyze">
                   <w:listItem w:displayText="Select PACE stage" w:value="Select PACE stage"/>
                   <w:listItem w:displayText="Plan" w:value="Plan"/>
@@ -1600,7 +1566,7 @@
             <w:sdt>
               <w:sdtPr>
                 <w:alias w:val="Milestone tasks"/>
-                <w:id w:val="-1037170217"/>
+                <w:id w:val="-1461439429"/>
                 <w:dropDownList w:lastValue="Visualization building">
                   <w:listItem w:displayText="Choose a task" w:value="Choose a task"/>
                   <w:listItem w:displayText="Compute descriptive statistics" w:value="Compute descriptive statistics"/>
@@ -1653,7 +1619,7 @@
             <w:sdt>
               <w:sdtPr>
                 <w:alias w:val="PACE dropdown selector"/>
-                <w:id w:val="-9219025"/>
+                <w:id w:val="-433488237"/>
                 <w:dropDownList w:lastValue="Analyze">
                   <w:listItem w:displayText="Select PACE stage" w:value="Select PACE stage"/>
                   <w:listItem w:displayText="Plan" w:value="Plan"/>
@@ -1689,7 +1655,7 @@
             <w:sdt>
               <w:sdtPr>
                 <w:alias w:val="PACE dropdown selector"/>
-                <w:id w:val="-1749575172"/>
+                <w:id w:val="2121122912"/>
                 <w:dropDownList w:lastValue="Construct">
                   <w:listItem w:displayText="Select PACE stage" w:value="Select PACE stage"/>
                   <w:listItem w:displayText="Plan" w:value="Plan"/>
@@ -1867,7 +1833,7 @@
             <w:sdt>
               <w:sdtPr>
                 <w:alias w:val="Milestone tasks"/>
-                <w:id w:val="94772008"/>
+                <w:id w:val="-329497204"/>
                 <w:dropDownList w:lastValue="Compute descriptive statistics">
                   <w:listItem w:displayText="Choose a task" w:value="Choose a task"/>
                   <w:listItem w:displayText="Compute descriptive statistics" w:value="Compute descriptive statistics"/>
@@ -1920,7 +1886,7 @@
             <w:sdt>
               <w:sdtPr>
                 <w:alias w:val="PACE dropdown selector"/>
-                <w:id w:val="-1425545373"/>
+                <w:id w:val="-1849814585"/>
                 <w:dropDownList w:lastValue="Analyze">
                   <w:listItem w:displayText="Select PACE stage" w:value="Select PACE stage"/>
                   <w:listItem w:displayText="Plan" w:value="Plan"/>
@@ -2144,7 +2110,7 @@
             <w:sdt>
               <w:sdtPr>
                 <w:alias w:val="Milestone tasks"/>
-                <w:id w:val="-1803248854"/>
+                <w:id w:val="2067449230"/>
                 <w:dropDownList w:lastValue="Conduct hypothesis test">
                   <w:listItem w:displayText="Choose a task" w:value="Choose a task"/>
                   <w:listItem w:displayText="Compute descriptive statistics" w:value="Compute descriptive statistics"/>
@@ -2197,7 +2163,7 @@
             <w:sdt>
               <w:sdtPr>
                 <w:alias w:val="PACE dropdown selector"/>
-                <w:id w:val="1534324692"/>
+                <w:id w:val="1110055480"/>
                 <w:dropDownList w:lastValue="Analyze">
                   <w:listItem w:displayText="Select PACE stage" w:value="Select PACE stage"/>
                   <w:listItem w:displayText="Plan" w:value="Plan"/>
@@ -2233,7 +2199,7 @@
             <w:sdt>
               <w:sdtPr>
                 <w:alias w:val="PACE dropdown selector"/>
-                <w:id w:val="1300382933"/>
+                <w:id w:val="876113721"/>
                 <w:dropDownList w:lastValue="Construct">
                   <w:listItem w:displayText="Select PACE stage" w:value="Select PACE stage"/>
                   <w:listItem w:displayText="Plan" w:value="Plan"/>
@@ -2383,7 +2349,7 @@
             <w:sdt>
               <w:sdtPr>
                 <w:alias w:val="Milestone tasks"/>
-                <w:id w:val="-737245569"/>
+                <w:id w:val="-1161514781"/>
                 <w:dropDownList w:lastValue="Build a regression model">
                   <w:listItem w:displayText="Choose a task" w:value="Choose a task"/>
                   <w:listItem w:displayText="Compute descriptive statistics" w:value="Compute descriptive statistics"/>
@@ -2436,7 +2402,7 @@
             <w:sdt>
               <w:sdtPr>
                 <w:alias w:val="PACE dropdown selector"/>
-                <w:id w:val="-333350231"/>
+                <w:id w:val="-757619443"/>
                 <w:dropDownList w:lastValue="Analyze">
                   <w:listItem w:displayText="Select PACE stage" w:value="Select PACE stage"/>
                   <w:listItem w:displayText="Plan" w:value="Plan"/>
@@ -2472,7 +2438,7 @@
             <w:sdt>
               <w:sdtPr>
                 <w:alias w:val="PACE dropdown selector"/>
-                <w:id w:val="-1573593903"/>
+                <w:id w:val="-1997863115"/>
                 <w:dropDownList w:lastValue="Construct">
                   <w:listItem w:displayText="Select PACE stage" w:value="Select PACE stage"/>
                   <w:listItem w:displayText="Plan" w:value="Plan"/>
@@ -2653,7 +2619,7 @@
             <w:sdt>
               <w:sdtPr>
                 <w:alias w:val="Milestone tasks"/>
-                <w:id w:val="1152490101"/>
+                <w:id w:val="728220889"/>
                 <w:dropDownList w:lastValue="Evaluate the model">
                   <w:listItem w:displayText="Choose a task" w:value="Choose a task"/>
                   <w:listItem w:displayText="Compute descriptive statistics" w:value="Compute descriptive statistics"/>
@@ -2706,7 +2672,7 @@
             <w:sdt>
               <w:sdtPr>
                 <w:alias w:val="PACE dropdown selector"/>
-                <w:id w:val="680949792"/>
+                <w:id w:val="256680580"/>
                 <w:dropDownList w:lastValue="Execute">
                   <w:listItem w:displayText="Select PACE stage" w:value="Select PACE stage"/>
                   <w:listItem w:displayText="Plan" w:value="Plan"/>
@@ -2793,7 +2759,7 @@
                 <w:highlight w:val="yellow"/>
                 <w:rtl w:val="0"/>
               </w:rPr>
-              <w:t xml:space="preserve">Data Analyst Manager</w:t>
+              <w:t xml:space="preserve">Director of Data Analysis</w:t>
             </w:r>
           </w:p>
         </w:tc>
@@ -2857,7 +2823,7 @@
             <w:sdt>
               <w:sdtPr>
                 <w:alias w:val="Milestone tasks"/>
-                <w:id w:val="-386448991"/>
+                <w:id w:val="-810718203"/>
                 <w:dropDownList w:lastValue="Communicate final insights with stakeholders">
                   <w:listItem w:displayText="Choose a task" w:value="Choose a task"/>
                   <w:listItem w:displayText="Compute descriptive statistics" w:value="Compute descriptive statistics"/>
@@ -2910,7 +2876,7 @@
             <w:sdt>
               <w:sdtPr>
                 <w:alias w:val="PACE dropdown selector"/>
-                <w:id w:val="1939707320"/>
+                <w:id w:val="1515438108"/>
                 <w:dropDownList w:lastValue="Execute">
                   <w:listItem w:displayText="Select PACE stage" w:value="Select PACE stage"/>
                   <w:listItem w:displayText="Plan" w:value="Plan"/>
@@ -3061,7 +3027,7 @@
             <w:sdt>
               <w:sdtPr>
                 <w:alias w:val="Milestone tasks"/>
-                <w:id w:val="752268238"/>
+                <w:id w:val="327999026"/>
                 <w:dropDownList w:lastValue="Not necessary for this project ">
                   <w:listItem w:displayText="Choose a task" w:value="Choose a task"/>
                   <w:listItem w:displayText="Compute descriptive statistics" w:value="Compute descriptive statistics"/>
@@ -3114,7 +3080,7 @@
             <w:sdt>
               <w:sdtPr>
                 <w:alias w:val="PACE dropdown selector"/>
-                <w:id w:val="1577361215"/>
+                <w:id w:val="1153092003"/>
                 <w:dropDownList w:lastValue="Select PACE stage">
                   <w:listItem w:displayText="Select PACE stage" w:value="Select PACE stage"/>
                   <w:listItem w:displayText="Plan" w:value="Plan"/>
@@ -3221,6 +3187,88 @@
         <w:rPr>
           <w:rtl w:val="0"/>
         </w:rPr>
+      </w:r>
+    </w:p>
+    <w:p>
+      <w:pPr>
+        <w:rPr/>
+      </w:pPr>
+      <w:r>
+        <w:rPr>
+          <w:rtl w:val="0"/>
+        </w:rPr>
+      </w:r>
+    </w:p>
+    <w:p>
+      <w:pPr>
+        <w:rPr/>
+      </w:pPr>
+      <w:r>
+        <w:rPr>
+          <w:rtl w:val="0"/>
+        </w:rPr>
+        <w:t xml:space="preserve">The estimated times for the milestones are as follows:</w:t>
+        <w:br w:type="textWrapping"/>
+      </w:r>
+    </w:p>
+    <w:p>
+      <w:pPr>
+        <w:ind w:firstLine="720"/>
+        <w:rPr/>
+      </w:pPr>
+      <w:r>
+        <w:rPr>
+          <w:rtl w:val="0"/>
+        </w:rPr>
+        <w:t xml:space="preserve">Milestone 1: 1 days</w:t>
+      </w:r>
+    </w:p>
+    <w:p>
+      <w:pPr>
+        <w:ind w:firstLine="720"/>
+        <w:rPr/>
+      </w:pPr>
+      <w:r>
+        <w:rPr>
+          <w:rtl w:val="0"/>
+        </w:rPr>
+        <w:t xml:space="preserve">Milestone 2: 2-3 days</w:t>
+      </w:r>
+    </w:p>
+    <w:p>
+      <w:pPr>
+        <w:ind w:firstLine="720"/>
+        <w:rPr/>
+      </w:pPr>
+      <w:r>
+        <w:rPr>
+          <w:rtl w:val="0"/>
+        </w:rPr>
+        <w:t xml:space="preserve">Milestone 3: 2 days</w:t>
+      </w:r>
+    </w:p>
+    <w:p>
+      <w:pPr>
+        <w:ind w:firstLine="720"/>
+        <w:rPr/>
+      </w:pPr>
+      <w:r>
+        <w:rPr>
+          <w:rtl w:val="0"/>
+        </w:rPr>
+        <w:t xml:space="preserve">Milestone 4: 1 day</w:t>
+      </w:r>
+    </w:p>
+    <w:p>
+      <w:pPr>
+        <w:ind w:firstLine="720"/>
+        <w:rPr/>
+      </w:pPr>
+      <w:r>
+        <w:rPr>
+          <w:rtl w:val="0"/>
+        </w:rPr>
+        <w:t xml:space="preserve">Milestone 5: 1-2 days</w:t>
       </w:r>
     </w:p>
     <w:p>
@@ -3261,12 +3309,12 @@
         <wp:inline distB="114300" distT="114300" distL="114300" distR="114300">
           <wp:extent cx="461963" cy="461963"/>
           <wp:effectExtent b="0" l="0" r="0" t="0"/>
-          <wp:docPr id="2" name="image2.png"/>
+          <wp:docPr id="2" name="image1.png"/>
           <a:graphic>
             <a:graphicData uri="http://schemas.openxmlformats.org/drawingml/2006/picture">
               <pic:pic>
                 <pic:nvPicPr>
-                  <pic:cNvPr id="0" name="image2.png"/>
+                  <pic:cNvPr id="0" name="image1.png"/>
                   <pic:cNvPicPr preferRelativeResize="0"/>
                 </pic:nvPicPr>
                 <pic:blipFill>
@@ -3329,12 +3377,12 @@
           <wp:extent cx="7784306" cy="95250"/>
           <wp:effectExtent b="0" l="0" r="0" t="0"/>
           <wp:wrapNone/>
-          <wp:docPr id="1" name="image1.png"/>
+          <wp:docPr id="1" name="image2.png"/>
           <a:graphic>
             <a:graphicData uri="http://schemas.openxmlformats.org/drawingml/2006/picture">
               <pic:pic>
                 <pic:nvPicPr>
-                  <pic:cNvPr id="0" name="image1.png"/>
+                  <pic:cNvPr id="0" name="image2.png"/>
                   <pic:cNvPicPr preferRelativeResize="0"/>
                 </pic:nvPicPr>
                 <pic:blipFill>

</xml_diff>